<commit_message>
Đổi thời gian bắt đầu thử thách xanh sang Tuần 3
Co-Authored-By: Claude Opus 5 <noreply@anthropic.com>
</commit_message>
<xml_diff>
--- a/goc-hoc-tap/bai-hoc-gddp10/phieu-kttx1-thu-thach-xanh-5-ngay.docx
+++ b/goc-hoc-tap/bai-hoc-gddp10/phieu-kttx1-thu-thach-xanh-5-ngay.docx
@@ -714,7 +714,7 @@
                 <w:i w:val="0"/>
                 <w:sz w:val="22"/>
               </w:rPr>
-              <w:t>Nhận phiếu</w:t>
+              <w:t>Bắt đầu làm</w:t>
             </w:r>
           </w:p>
         </w:tc>
@@ -734,7 +734,7 @@
                 <w:i w:val="0"/>
                 <w:sz w:val="22"/>
               </w:rPr>
-              <w:t>Tuần 4 (28/09 – 02/10/2026).</w:t>
+              <w:t>Tuần 3 (21/09 – 25/09/2026).</w:t>
             </w:r>
           </w:p>
         </w:tc>
@@ -777,7 +777,7 @@
                 <w:i w:val="0"/>
                 <w:sz w:val="22"/>
               </w:rPr>
-              <w:t>5 ngày bất kỳ kể từ khi nhận phiếu đến trước hạn nộp.</w:t>
+              <w:t>5 ngày bất kỳ, hoàn thành trước hạn nộp.</w:t>
             </w:r>
           </w:p>
         </w:tc>
@@ -1589,7 +1589,7 @@
                 <w:i w:val="0"/>
                 <w:sz w:val="22"/>
               </w:rPr>
-              <w:t>NGÀY 1 – Thứ Hai, ngày 28/9/2026</w:t>
+              <w:t>NGÀY 1 – Thứ Tư, ngày 23/9/2026</w:t>
             </w:r>
           </w:p>
           <w:p>

</xml_diff>